<commit_message>
docs: extend the user manual with the latest features
New section 8 walks through building and printing a report (range,
chips, grouping, columns, live preview); the later sections renumber to
15. The overview now covers avatars, credentials, the red now line and
the past-appointment fade; creating an appointment gains the patient
phone step; editing gains the Book again tip; filtering gains the
clickable clinic chips; Manage mentions hours, holiday policy and
credentials. Six new SCREENSHOT TO CAPTURE boxes (29 total) mark the
images to add.
</commit_message>
<xml_diff>
--- a/Sonographer-Scheduler-User-Manual.docx
+++ b/Sonographer-Scheduler-User-Manual.docx
@@ -64,7 +64,7 @@
     </w:p>
     <w:p>
       <w:r>
-        <w:t>When you open the app it shows today's schedule in the Day view. Sonographers are the columns and the hours of the day run down the left side. The toolbar at the top holds the Day/Week toggle, the date navigation, the filters, and the main action buttons. A legend labelled "Clinics" maps each colour to a clinic and its opening hours.</w:t>
+        <w:t>When you open the app it shows today's schedule in the Day view. Sonographers are the columns and the hours of the day run down the left side. The toolbar at the top holds the Day/Week toggle, the date navigation, the filters, and the main action buttons. A legend labelled "Clinics" maps each colour to a clinic and its opening hours. Each sonographer's column header shows an initials avatar and their professional credentials (for example RDMS, RVT). On today's schedule a red line marks the current time — the grid opens already scrolled to it — and appointments that have already ended appear faded.</w:t>
       </w:r>
     </w:p>
     <w:tbl>
@@ -92,6 +92,37 @@
             </w:r>
             <w:r>
               <w:t>The whole app on first open (Day view), with red arrows pointing to: (1) the Day/Week toggle, (2) the Previous / Today / Next buttons, (3) the "New appointment" button, and (4) the "Clinics" legend.</w:t>
+            </w:r>
+          </w:p>
+        </w:tc>
+      </w:tr>
+    </w:tbl>
+    <w:p/>
+    <w:tbl>
+      <w:tblPr>
+        <w:tblStyle w:val="TableGrid"/>
+        <w:tblW w:type="auto" w:w="0"/>
+        <w:tblLook w:firstColumn="1" w:firstRow="1" w:lastColumn="0" w:lastRow="0" w:noHBand="0" w:noVBand="1" w:val="04A0"/>
+      </w:tblPr>
+      <w:tblGrid>
+        <w:gridCol w:w="8640"/>
+      </w:tblGrid>
+      <w:tr>
+        <w:tc>
+          <w:tcPr>
+            <w:tcW w:type="dxa" w:w="8640"/>
+            <w:shd w:val="clear" w:color="auto" w:fill="EEF2FF"/>
+          </w:tcPr>
+          <w:p>
+            <w:r>
+              <w:rPr>
+                <w:b/>
+                <w:color w:val="373099"/>
+              </w:rPr>
+              <w:t xml:space="preserve">SCREENSHOT TO CAPTURE  —  </w:t>
+            </w:r>
+            <w:r>
+              <w:t>Today's Day view with red arrows pointing to: (1) the red now line marking the current time, (2) an earlier appointment shown faded because it already ended, and (3) a sonographer's avatar and credentials in the column header.</w:t>
             </w:r>
           </w:p>
         </w:tc>
@@ -214,7 +245,7 @@
     </w:p>
     <w:p>
       <w:r>
-        <w:t>The Previous and Next buttons move one day at a time in the Day view, or one week at a time in the Week view. The Today button jumps straight back to the current day or week.</w:t>
+        <w:t>The Previous and Next buttons move one day at a time in the Day view, or one week at a time in the Week view. The Today button jumps straight back to the current day or week. Next to the date there is also a small date picker — pick any date there to jump straight to it, in either view.</w:t>
       </w:r>
     </w:p>
     <w:tbl>
@@ -241,7 +272,7 @@
               <w:t xml:space="preserve">SCREENSHOT TO CAPTURE  —  </w:t>
             </w:r>
             <w:r>
-              <w:t>The toolbar with red arrows pointing to the Previous, Today and Next buttons.</w:t>
+              <w:t>The toolbar with red arrows pointing to the Previous, Today and Next buttons and the jump-to-date picker next to the date.</w:t>
             </w:r>
           </w:p>
         </w:tc>
@@ -275,6 +306,14 @@
       </w:pPr>
       <w:r>
         <w:t>In the dialog, type the patient's name. Pick an existing patient from the list, or type a new name to register them on the fly.</w:t>
+      </w:r>
+    </w:p>
+    <w:p>
+      <w:pPr>
+        <w:pStyle w:val="ListNumber"/>
+      </w:pPr>
+      <w:r>
+        <w:t>Add or check the patient's phone number. A registered patient's number fills in automatically; any change is saved back to their record.</w:t>
       </w:r>
     </w:p>
     <w:p>
@@ -364,7 +403,7 @@
               <w:t xml:space="preserve">SCREENSHOT TO CAPTURE  —  </w:t>
             </w:r>
             <w:r>
-              <w:t>The appointment form open, with red arrows pointing to the Patient name, Consultation type, Sonographer, Clinic, Date, Start and End fields.</w:t>
+              <w:t>The appointment form open, with red arrows pointing to the Patient name, Patient phone, Consultation type, Sonographer, Clinic, Date, Start and End fields.</w:t>
             </w:r>
           </w:p>
         </w:tc>
@@ -490,6 +529,42 @@
             </w:r>
             <w:r>
               <w:t>The edit dialog with a red arrow pointing to the "Save" button.</w:t>
+            </w:r>
+          </w:p>
+        </w:tc>
+      </w:tr>
+    </w:tbl>
+    <w:p/>
+    <w:p>
+      <w:r>
+        <w:t>Tip: The "Book again" button in the edit dialog starts a brand-new booking for the same patient, phone number, study and clinic — you only pick the new date and time. Perfect for follow-up studies.</w:t>
+      </w:r>
+    </w:p>
+    <w:tbl>
+      <w:tblPr>
+        <w:tblStyle w:val="TableGrid"/>
+        <w:tblW w:type="auto" w:w="0"/>
+        <w:tblLook w:firstColumn="1" w:firstRow="1" w:lastColumn="0" w:lastRow="0" w:noHBand="0" w:noVBand="1" w:val="04A0"/>
+      </w:tblPr>
+      <w:tblGrid>
+        <w:gridCol w:w="8640"/>
+      </w:tblGrid>
+      <w:tr>
+        <w:tc>
+          <w:tcPr>
+            <w:tcW w:type="dxa" w:w="8640"/>
+            <w:shd w:val="clear" w:color="auto" w:fill="EEF2FF"/>
+          </w:tcPr>
+          <w:p>
+            <w:r>
+              <w:rPr>
+                <w:b/>
+                <w:color w:val="373099"/>
+              </w:rPr>
+              <w:t xml:space="preserve">SCREENSHOT TO CAPTURE  —  </w:t>
+            </w:r>
+            <w:r>
+              <w:t>The edit dialog with a red arrow pointing to the "Book again" button.</w:t>
             </w:r>
           </w:p>
         </w:tc>
@@ -663,7 +738,161 @@
         <w:pStyle w:val="Heading1"/>
       </w:pPr>
       <w:r>
-        <w:t>8. Rescheduling by drag-and-drop</w:t>
+        <w:t>8. Reports: build one and print it</w:t>
+      </w:r>
+    </w:p>
+    <w:p>
+      <w:r>
+        <w:t>The Reports button builds a printable report of your appointments over any period — a day, a week, a month, or any range up to 31 days.</w:t>
+      </w:r>
+    </w:p>
+    <w:p>
+      <w:pPr>
+        <w:pStyle w:val="ListNumber"/>
+      </w:pPr>
+      <w:r>
+        <w:t>Click the "Reports" button in the toolbar.</w:t>
+      </w:r>
+    </w:p>
+    <w:p>
+      <w:pPr>
+        <w:pStyle w:val="ListNumber"/>
+      </w:pPr>
+      <w:r>
+        <w:t>Pick the From and To dates — or use the Today, This week or This month shortcuts.</w:t>
+      </w:r>
+    </w:p>
+    <w:p>
+      <w:pPr>
+        <w:pStyle w:val="ListNumber"/>
+      </w:pPr>
+      <w:r>
+        <w:t>Optionally narrow the report by tapping sonographer or clinic chips (leave them all unselected to include everyone).</w:t>
+      </w:r>
+    </w:p>
+    <w:p>
+      <w:pPr>
+        <w:pStyle w:val="ListNumber"/>
+      </w:pPr>
+      <w:r>
+        <w:t>Choose how to group the rows — by Day, Sonographer or Clinic — and tick the columns you want: Phone, Study, Notes.</w:t>
+      </w:r>
+    </w:p>
+    <w:p>
+      <w:pPr>
+        <w:pStyle w:val="ListNumber"/>
+      </w:pPr>
+      <w:r>
+        <w:t>Check the live preview: it shows the totals (appointments, booked time, sonographers and clinics involved) and the grouped tables exactly as they will print.</w:t>
+      </w:r>
+    </w:p>
+    <w:p>
+      <w:pPr>
+        <w:pStyle w:val="ListNumber"/>
+      </w:pPr>
+      <w:r>
+        <w:t>Click "Print report" — the browser's print dialog opens with the report; print it or save it as a PDF.</w:t>
+      </w:r>
+    </w:p>
+    <w:tbl>
+      <w:tblPr>
+        <w:tblStyle w:val="TableGrid"/>
+        <w:tblW w:type="auto" w:w="0"/>
+        <w:tblLook w:firstColumn="1" w:firstRow="1" w:lastColumn="0" w:lastRow="0" w:noHBand="0" w:noVBand="1" w:val="04A0"/>
+      </w:tblPr>
+      <w:tblGrid>
+        <w:gridCol w:w="8640"/>
+      </w:tblGrid>
+      <w:tr>
+        <w:tc>
+          <w:tcPr>
+            <w:tcW w:type="dxa" w:w="8640"/>
+            <w:shd w:val="clear" w:color="auto" w:fill="EEF2FF"/>
+          </w:tcPr>
+          <w:p>
+            <w:r>
+              <w:rPr>
+                <w:b/>
+                <w:color w:val="373099"/>
+              </w:rPr>
+              <w:t xml:space="preserve">SCREENSHOT TO CAPTURE  —  </w:t>
+            </w:r>
+            <w:r>
+              <w:t>The toolbar with a red arrow pointing to the "Reports" button.</w:t>
+            </w:r>
+          </w:p>
+        </w:tc>
+      </w:tr>
+    </w:tbl>
+    <w:p/>
+    <w:tbl>
+      <w:tblPr>
+        <w:tblStyle w:val="TableGrid"/>
+        <w:tblW w:type="auto" w:w="0"/>
+        <w:tblLook w:firstColumn="1" w:firstRow="1" w:lastColumn="0" w:lastRow="0" w:noHBand="0" w:noVBand="1" w:val="04A0"/>
+      </w:tblPr>
+      <w:tblGrid>
+        <w:gridCol w:w="8640"/>
+      </w:tblGrid>
+      <w:tr>
+        <w:tc>
+          <w:tcPr>
+            <w:tcW w:type="dxa" w:w="8640"/>
+            <w:shd w:val="clear" w:color="auto" w:fill="EEF2FF"/>
+          </w:tcPr>
+          <w:p>
+            <w:r>
+              <w:rPr>
+                <w:b/>
+                <w:color w:val="373099"/>
+              </w:rPr>
+              <w:t xml:space="preserve">SCREENSHOT TO CAPTURE  —  </w:t>
+            </w:r>
+            <w:r>
+              <w:t>The Reports dialog open, with red arrows pointing to: (1) the date range and its shortcuts, (2) the sonographer and clinic chips, (3) the Group by and Columns options, and (4) the live preview underneath.</w:t>
+            </w:r>
+          </w:p>
+        </w:tc>
+      </w:tr>
+    </w:tbl>
+    <w:p/>
+    <w:tbl>
+      <w:tblPr>
+        <w:tblStyle w:val="TableGrid"/>
+        <w:tblW w:type="auto" w:w="0"/>
+        <w:tblLook w:firstColumn="1" w:firstRow="1" w:lastColumn="0" w:lastRow="0" w:noHBand="0" w:noVBand="1" w:val="04A0"/>
+      </w:tblPr>
+      <w:tblGrid>
+        <w:gridCol w:w="8640"/>
+      </w:tblGrid>
+      <w:tr>
+        <w:tc>
+          <w:tcPr>
+            <w:tcW w:type="dxa" w:w="8640"/>
+            <w:shd w:val="clear" w:color="auto" w:fill="EEF2FF"/>
+          </w:tcPr>
+          <w:p>
+            <w:r>
+              <w:rPr>
+                <w:b/>
+                <w:color w:val="373099"/>
+              </w:rPr>
+              <w:t xml:space="preserve">SCREENSHOT TO CAPTURE  —  </w:t>
+            </w:r>
+            <w:r>
+              <w:t>The print preview window showing a report grouped by day, with its summary totals at the top.</w:t>
+            </w:r>
+          </w:p>
+        </w:tc>
+      </w:tr>
+    </w:tbl>
+    <w:p/>
+    <w:p>
+      <w:pPr>
+        <w:pStyle w:val="Heading1"/>
+      </w:pPr>
+      <w:r>
+        <w:t>9. Rescheduling by drag-and-drop</w:t>
       </w:r>
     </w:p>
     <w:p>
@@ -774,7 +1003,7 @@
         <w:pStyle w:val="Heading1"/>
       </w:pPr>
       <w:r>
-        <w:t>9. Scheduling rules and warnings</w:t>
+        <w:t>10. Scheduling rules and warnings</w:t>
       </w:r>
     </w:p>
     <w:p>
@@ -842,7 +1071,7 @@
         <w:pStyle w:val="Heading1"/>
       </w:pPr>
       <w:r>
-        <w:t>10. Filtering the schedule</w:t>
+        <w:t>11. Filtering the schedule</w:t>
       </w:r>
     </w:p>
     <w:p>
@@ -947,11 +1176,47 @@
     </w:tbl>
     <w:p/>
     <w:p>
+      <w:r>
+        <w:t>Tip: The "Clinics" legend under the toolbar is clickable — tap a clinic chip to show only that clinic (tap more to add them, tap again to clear). It stays in sync with the Filters panel, and chips outside the active filter fade back.</w:t>
+      </w:r>
+    </w:p>
+    <w:tbl>
+      <w:tblPr>
+        <w:tblStyle w:val="TableGrid"/>
+        <w:tblW w:type="auto" w:w="0"/>
+        <w:tblLook w:firstColumn="1" w:firstRow="1" w:lastColumn="0" w:lastRow="0" w:noHBand="0" w:noVBand="1" w:val="04A0"/>
+      </w:tblPr>
+      <w:tblGrid>
+        <w:gridCol w:w="8640"/>
+      </w:tblGrid>
+      <w:tr>
+        <w:tc>
+          <w:tcPr>
+            <w:tcW w:type="dxa" w:w="8640"/>
+            <w:shd w:val="clear" w:color="auto" w:fill="EEF2FF"/>
+          </w:tcPr>
+          <w:p>
+            <w:r>
+              <w:rPr>
+                <w:b/>
+                <w:color w:val="373099"/>
+              </w:rPr>
+              <w:t xml:space="preserve">SCREENSHOT TO CAPTURE  —  </w:t>
+            </w:r>
+            <w:r>
+              <w:t>The Clinics legend with one chip active and the others faded, and the schedule behind it showing only that clinic's appointments.</w:t>
+            </w:r>
+          </w:p>
+        </w:tc>
+      </w:tr>
+    </w:tbl>
+    <w:p/>
+    <w:p>
       <w:pPr>
         <w:pStyle w:val="Heading1"/>
       </w:pPr>
       <w:r>
-        <w:t>11. Managing your hospital</w:t>
+        <w:t>12. Managing your hospital</w:t>
       </w:r>
     </w:p>
     <w:p>
@@ -980,7 +1245,7 @@
         <w:pStyle w:val="ListNumber"/>
       </w:pPr>
       <w:r>
-        <w:t>Add a new entry, or edit or delete an existing one — including its icon and colour.</w:t>
+        <w:t>Add a new entry, or edit or delete an existing one — including its icon and colour, a clinic's opening hours and holiday policy, and a sonographer's professional credentials (for example RDMS, RVT).</w:t>
       </w:r>
     </w:p>
     <w:p>
@@ -1073,7 +1338,7 @@
         <w:pStyle w:val="Heading1"/>
       </w:pPr>
       <w:r>
-        <w:t>12. The guided Tutorial</w:t>
+        <w:t>13. The guided Tutorial</w:t>
       </w:r>
     </w:p>
     <w:p>
@@ -1172,7 +1437,7 @@
         <w:pStyle w:val="Heading1"/>
       </w:pPr>
       <w:r>
-        <w:t>13. Learn more about the product</w:t>
+        <w:t>14. Learn more about the product</w:t>
       </w:r>
     </w:p>
     <w:p>
@@ -1266,7 +1531,7 @@
         <w:pStyle w:val="Heading1"/>
       </w:pPr>
       <w:r>
-        <w:t>14. Your data is saved automatically</w:t>
+        <w:t>15. Your data is saved automatically</w:t>
       </w:r>
     </w:p>
     <w:p>

</xml_diff>